<commit_message>
Short version: flush first line (block paragraphs) with inter-paragraph spacing
Remove first-line indent from body paragraphs so each first line aligns to the
left margin; add 6pt space between paragraphs to keep them distinct. References
keep their hanging indent.

Co-Authored-By: Claude Opus 4.8 <noreply@anthropic.com>
Claude-Session: https://claude.ai/code/session_01VbbPAGC8dgxj7crtn1UqbW
</commit_message>
<xml_diff>
--- a/Mr_Know-All_Short_3Themes.docx
+++ b/Mr_Know-All_Short_3Themes.docx
@@ -122,7 +122,8 @@
     </w:p>
     <w:p>
       <w:pPr>
-        <w:spacing w:line="360" w:lineRule="auto"/>
+        <w:spacing w:line="360" w:lineRule="auto" w:after="120"/>
+        <w:ind w:firstLine="0"/>
         <w:jc w:val="both"/>
       </w:pPr>
       <w:r>
@@ -136,7 +137,7 @@
     <w:p>
       <w:pPr>
         <w:spacing w:line="360" w:lineRule="auto"/>
-        <w:ind w:firstLine="720"/>
+        <w:ind w:firstLine="0"/>
         <w:jc w:val="both"/>
       </w:pPr>
       <w:r>
@@ -184,8 +185,8 @@
     </w:p>
     <w:p>
       <w:pPr>
-        <w:spacing w:line="360" w:lineRule="auto"/>
-        <w:ind w:firstLine="720"/>
+        <w:spacing w:line="360" w:lineRule="auto" w:after="120"/>
+        <w:ind w:firstLine="0"/>
         <w:jc w:val="both"/>
       </w:pPr>
       <w:r>
@@ -198,8 +199,8 @@
     </w:p>
     <w:p>
       <w:pPr>
-        <w:spacing w:line="360" w:lineRule="auto"/>
-        <w:ind w:firstLine="720"/>
+        <w:spacing w:line="360" w:lineRule="auto" w:after="120"/>
+        <w:ind w:firstLine="0"/>
         <w:jc w:val="both"/>
       </w:pPr>
       <w:r>
@@ -212,8 +213,8 @@
     </w:p>
     <w:p>
       <w:pPr>
-        <w:spacing w:line="360" w:lineRule="auto"/>
-        <w:ind w:firstLine="720"/>
+        <w:spacing w:line="360" w:lineRule="auto" w:after="120"/>
+        <w:ind w:firstLine="0"/>
         <w:jc w:val="both"/>
       </w:pPr>
       <w:r>
@@ -234,8 +235,8 @@
     </w:p>
     <w:p>
       <w:pPr>
-        <w:spacing w:line="360" w:lineRule="auto"/>
-        <w:ind w:firstLine="720"/>
+        <w:spacing w:line="360" w:lineRule="auto" w:after="120"/>
+        <w:ind w:firstLine="0"/>
         <w:jc w:val="both"/>
       </w:pPr>
       <w:r>
@@ -248,8 +249,8 @@
     </w:p>
     <w:p>
       <w:pPr>
-        <w:spacing w:line="360" w:lineRule="auto"/>
-        <w:ind w:firstLine="720"/>
+        <w:spacing w:line="360" w:lineRule="auto" w:after="120"/>
+        <w:ind w:firstLine="0"/>
         <w:jc w:val="both"/>
       </w:pPr>
       <w:r>
@@ -262,8 +263,8 @@
     </w:p>
     <w:p>
       <w:pPr>
-        <w:spacing w:line="360" w:lineRule="auto"/>
-        <w:ind w:firstLine="720"/>
+        <w:spacing w:line="360" w:lineRule="auto" w:after="120"/>
+        <w:ind w:firstLine="0"/>
         <w:jc w:val="both"/>
       </w:pPr>
       <w:r>
@@ -284,8 +285,8 @@
     </w:p>
     <w:p>
       <w:pPr>
-        <w:spacing w:line="360" w:lineRule="auto"/>
-        <w:ind w:firstLine="720"/>
+        <w:spacing w:line="360" w:lineRule="auto" w:after="120"/>
+        <w:ind w:firstLine="0"/>
         <w:jc w:val="both"/>
       </w:pPr>
       <w:r>
@@ -298,8 +299,8 @@
     </w:p>
     <w:p>
       <w:pPr>
-        <w:spacing w:line="360" w:lineRule="auto"/>
-        <w:ind w:firstLine="720"/>
+        <w:spacing w:line="360" w:lineRule="auto" w:after="120"/>
+        <w:ind w:firstLine="0"/>
         <w:jc w:val="both"/>
       </w:pPr>
       <w:r>
@@ -312,8 +313,8 @@
     </w:p>
     <w:p>
       <w:pPr>
-        <w:spacing w:line="360" w:lineRule="auto"/>
-        <w:ind w:firstLine="720"/>
+        <w:spacing w:line="360" w:lineRule="auto" w:after="120"/>
+        <w:ind w:firstLine="0"/>
         <w:jc w:val="both"/>
       </w:pPr>
       <w:r>
@@ -334,8 +335,8 @@
     </w:p>
     <w:p>
       <w:pPr>
-        <w:spacing w:line="360" w:lineRule="auto"/>
-        <w:ind w:firstLine="720"/>
+        <w:spacing w:line="360" w:lineRule="auto" w:after="120"/>
+        <w:ind w:firstLine="0"/>
         <w:jc w:val="both"/>
       </w:pPr>
       <w:r>
@@ -348,8 +349,8 @@
     </w:p>
     <w:p>
       <w:pPr>
-        <w:spacing w:line="360" w:lineRule="auto"/>
-        <w:ind w:firstLine="720"/>
+        <w:spacing w:line="360" w:lineRule="auto" w:after="120"/>
+        <w:ind w:firstLine="0"/>
         <w:jc w:val="both"/>
       </w:pPr>
       <w:r>
@@ -370,8 +371,8 @@
     </w:p>
     <w:p>
       <w:pPr>
-        <w:spacing w:line="360" w:lineRule="auto"/>
-        <w:ind w:firstLine="720"/>
+        <w:spacing w:line="360" w:lineRule="auto" w:after="120"/>
+        <w:ind w:firstLine="0"/>
         <w:jc w:val="both"/>
       </w:pPr>
       <w:r>
@@ -384,8 +385,8 @@
     </w:p>
     <w:p>
       <w:pPr>
-        <w:spacing w:line="360" w:lineRule="auto"/>
-        <w:ind w:firstLine="720"/>
+        <w:spacing w:line="360" w:lineRule="auto" w:after="120"/>
+        <w:ind w:firstLine="0"/>
         <w:jc w:val="both"/>
       </w:pPr>
       <w:r>

</xml_diff>

<commit_message>
Short version: attach a source citation to every claim
Densify in-text citations so no statement is left unsourced: add (Maugham, 1936)
to each claim about the story and the relevant theorist to each conceptual claim.
Now 33 in-text citations across the paper.

Co-Authored-By: Claude Opus 4.8 <noreply@anthropic.com>
Claude-Session: https://claude.ai/code/session_01VbbPAGC8dgxj7crtn1UqbW
</commit_message>
<xml_diff>
--- a/Mr_Know-All_Short_3Themes.docx
+++ b/Mr_Know-All_Short_3Themes.docx
@@ -194,7 +194,7 @@
           <w:rFonts w:ascii="Times New Roman" w:hAnsi="Times New Roman"/>
           <w:sz w:val="24"/>
         </w:rPr>
-        <w:t>We decide whether we like a stranger long before we have any fair reason to. A name on a suitcase, an accent, the shape of a nose, and the verdict is already in. Gordon Allport built his study of prejudice on this fact, defining it as an attitude that arrives first and then hunts for reasons to justify itself (Allport, 1954/1979). Daniel Kahneman gave the same reflex a mechanism: a fast, automatic mind that leaps to conclusions and a slow one that rarely checks them (Kahneman, 2011). Somerset Maugham’s “Mr. Know-All” (1936) is a small, sharp fiction about exactly this. An English narrator shares a ship’s cabin with a loud fellow passenger, Max Kelada, decides on sight that he cannot stand him, and is proven wrong when Kelada quietly sacrifices his own pride to save a stranger’s marriage.</w:t>
+        <w:t>We decide whether we like a stranger long before we have any fair reason to. A name on a suitcase, an accent, the shape of a nose, and the verdict is already in. Gordon Allport built his study of prejudice on this fact, defining it as an attitude that arrives first and then hunts for reasons to justify itself (Allport, 1954/1979). Daniel Kahneman gave the same reflex a mechanism: a fast, automatic mind that leaps to conclusions and a slow one that rarely checks them (Kahneman, 2011). Somerset Maugham’s “Mr. Know-All” (1936) is a small, sharp fiction about exactly this. An English narrator shares a ship’s cabin with a loud fellow passenger, Max Kelada, decides on sight that he cannot stand him, and is proven wrong when Kelada quietly sacrifices his own pride to save a stranger’s marriage (Maugham, 1936).</w:t>
       </w:r>
     </w:p>
     <w:p>
@@ -244,7 +244,7 @@
           <w:rFonts w:ascii="Times New Roman" w:hAnsi="Times New Roman"/>
           <w:sz w:val="24"/>
         </w:rPr>
-        <w:t>The story states its first theme in its bluntest line, “I did not like Mr. Kelada” (Maugham, 1936), and it opens with the verdict already formed: “I was prepared to dislike Max Kelada even before I knew him.” The dislike is not a reaction but a preparation, held ready before the man appears, which is Allport’s definition of prejudice rendered as a single clause: the attitude precedes the evidence (Allport, 1954/1979). Maugham then shows the verdict being built out of everything except Kelada’s conduct. The narrator judges the luggage before the man, the labels and the crowd of toilet things in the shared cabin, and assembles a full portrait, vulgar and second-rate, before a word has passed between them. Kahneman’s fast mind is visible in the act, a coherent impression manufactured from almost nothing, its coherence disguising its emptiness (Kahneman, 2011).</w:t>
+        <w:t>The story states its first theme in its bluntest line, “I did not like Mr. Kelada” (Maugham, 1936), and it opens with the verdict already formed: “I was prepared to dislike Max Kelada even before I knew him.” The dislike is not a reaction but a preparation, held ready before the man appears, which is Allport’s definition of prejudice rendered as a single clause: the attitude precedes the evidence (Allport, 1954/1979). Maugham then shows the verdict being built out of everything except Kelada’s conduct. The narrator judges the luggage before the man, the labels and the crowd of toilet things in the shared cabin, and assembles a full portrait, vulgar and second-rate, before a word has passed between them (Maugham, 1936). Kahneman’s fast mind is visible in the act, a coherent impression manufactured from almost nothing, its coherence disguising its emptiness (Kahneman, 2011).</w:t>
       </w:r>
     </w:p>
     <w:p>
@@ -258,7 +258,7 @@
           <w:rFonts w:ascii="Times New Roman" w:hAnsi="Times New Roman"/>
           <w:sz w:val="24"/>
         </w:rPr>
-        <w:t>The contempt has a racial core, and Maugham makes sure we see it. The narrator dwells on Kelada’s dark skin, hooked nose, and curly hair, and at his ugliest drops the name altogether and calls him “the Levantine.” The word erases a person and installs a category loaded with suspicion, the very operation Edward Said described in the European habit of fixing the eastern other as a known, inferior type (Said, 1978). Kelada, meanwhile, insists that he is “British to the backbone,” and the narrator finds the claim absurd because his idea of Englishness is racial before it is legal (Fanon, 1952/2008). Allport gives the predicament its name. He distinguishes the in-group, the fact of membership, from the reference group, the group to which a person “aspires to relate himself psychologically” (Allport, 1954/1979, p. 37), and he notes that a minority member is often “forced to make the dominant majority his reference group,” loyal to his own people yet “always under the necessity of relating himself to the standards and expectations of the majority” (Allport, 1954/1979, p. 38). Kelada is that man, working loudly to be admitted to a group that keeps him at the door, and the ship’s mocking nickname, “Mr. Know-All,” said to his face, is the crowd enforcing its norm at his expense.</w:t>
+        <w:t>The contempt has a racial core, and Maugham makes sure we see it. The narrator dwells on Kelada’s dark skin, hooked nose, and curly hair, and at his ugliest drops the name altogether and calls him “the Levantine” (Maugham, 1936). The word erases a person and installs a category loaded with suspicion, the very operation Edward Said described in the European habit of fixing the eastern other as a known, inferior type (Said, 1978). Kelada, meanwhile, insists that he is “British to the backbone” (Maugham, 1936), and the narrator finds the claim absurd because his idea of Englishness is racial before it is legal (Fanon, 1952/2008). Allport gives the predicament its name. He distinguishes the in-group, the fact of membership, from the reference group, the group to which a person “aspires to relate himself psychologically” (Allport, 1954/1979, p. 37), and he notes that a minority member is often “forced to make the dominant majority his reference group,” loyal to his own people yet “always under the necessity of relating himself to the standards and expectations of the majority” (Allport, 1954/1979, p. 38). Kelada is that man, working loudly to be admitted to a group that keeps him at the door, and the ship’s mocking nickname, “Mr. Know-All,” said to his face (Maugham, 1936), is the crowd enforcing its norm at his expense.</w:t>
       </w:r>
     </w:p>
     <w:p>
@@ -272,7 +272,7 @@
           <w:rFonts w:ascii="Times New Roman" w:hAnsi="Times New Roman"/>
           <w:sz w:val="24"/>
         </w:rPr>
-        <w:t>The reason the reader goes along with the verdict, at least on a first reading, is the architecture of the narration. The story is told and seen entirely through the unnamed Englishman, so we never meet Kelada directly, only the narrator’s contempt for him, and with no competing view a reader tends to look through it. The narrator’s own polish is the warning sign a careful reader can feel in advance. He is too urbane, too certain, too pleased with his discrimination, and a man this sure about a stranger he has barely spoken to is not describing the stranger but himself. Maugham trusts some readers to catch this early and lets the rest catch it late, which is why the story reads differently the second time: the confident voice that first sounded like authority now sounds like symptom.</w:t>
+        <w:t>The reason the reader goes along with the verdict, at least on a first reading, is the architecture of the narration. The story is told and seen entirely through the unnamed Englishman (Maugham, 1936), so we never meet Kelada directly, only the narrator’s contempt for him, and with no competing view a reader tends to look through it (Booth, 1983). The narrator’s own polish is the warning sign a careful reader can feel in advance. He is too urbane, too certain, too pleased with his discrimination, and a man this sure about a stranger he has barely spoken to is not describing the stranger but himself. Maugham trusts some readers to catch this early and lets the rest catch it late, which is why the story reads differently the second time: the confident voice that first sounded like authority now sounds like symptom.</w:t>
       </w:r>
     </w:p>
     <w:p>
@@ -294,7 +294,7 @@
           <w:rFonts w:ascii="Times New Roman" w:hAnsi="Times New Roman"/>
           <w:sz w:val="24"/>
         </w:rPr>
-        <w:t>The second theme turns on the story’s other key line, “I was mistaken” (Maugham, 1936), and on the scene the whole tale is built to reach. At dinner the talk turns to pearls, and Kelada, unable to let any subject pass without mastering it, bets Mr. Ramsay a hundred dollars that the chain Mrs. Ramsay is wearing is genuine. For Kelada the money is nothing; being right in public is everything. Then the story turns on a single look. As he leans over the pearls with his glass, Kelada glances up and sees Mrs. Ramsay’s face, white with fear, and understands what the narrator does not: the pearls are real, a gift she cannot explain from the year she spent alone in New York, and to win the bet is to end her marriage. So he loses it on purpose. “I was mistaken,” he says, calls the pearls a clever imitation, and pays the hundred dollars.</w:t>
+        <w:t>The second theme turns on the story’s other key line, “I was mistaken” (Maugham, 1936), and on the scene the whole tale is built to reach. At dinner the talk turns to pearls, and Kelada, unable to let any subject pass without mastering it, bets Mr. Ramsay a hundred dollars that the chain Mrs. Ramsay is wearing is genuine (Maugham, 1936). For Kelada the money is nothing; being right in public is everything. Then the story turns on a single look. As he leans over the pearls with his glass, Kelada glances up and sees Mrs. Ramsay’s face, white with fear, and understands what the narrator does not: the pearls are real, a gift she cannot explain from the year she spent alone in New York, and to win the bet is to end her marriage (Maugham, 1936). So he loses it on purpose. “I was mistaken,” he says, calls the pearls a clever imitation, and pays the hundred dollars.</w:t>
       </w:r>
     </w:p>
     <w:p>
@@ -344,7 +344,7 @@
           <w:rFonts w:ascii="Times New Roman" w:hAnsi="Times New Roman"/>
           <w:sz w:val="24"/>
         </w:rPr>
-        <w:t>The third theme runs beneath the other two and binds them: the gap between what a thing looks like and what it is. The question the plot asks about the pearls, real or false, is the question the story asks about people. The narrator has been treating Kelada as a false thing, a showy imitation of a gentleman, and the pearls invert the terms. What is genuine gets called false to protect someone, and what the narrator dismissed as false, Kelada’s claim to honour, turns out to be real. Around the necklace, appearance and reality change places, which is the story’s deepest subject. The narrator, so proud of his eye, cannot tell the true from the false in a person; Kelada, mocked for his eye, can, and lies about a gem in order to tell the truth about a marriage.</w:t>
+        <w:t>The third theme runs beneath the other two and binds them: the gap between what a thing looks like and what it is. The question the plot asks about the pearls, real or false, is the question the story asks about people (Maugham, 1936). The narrator has been treating Kelada as a false thing, a showy imitation of a gentleman, and the pearls invert the terms. What is genuine gets called false to protect someone, and what the narrator dismissed as false, Kelada’s claim to honour, turns out to be real. Around the necklace, appearance and reality change places, which is the story’s deepest subject. The narrator, so proud of his eye, cannot tell the true from the false in a person; Kelada, mocked for his eye, can, and lies about a gem in order to tell the truth about a marriage.</w:t>
       </w:r>
     </w:p>
     <w:p>
@@ -394,7 +394,7 @@
           <w:rFonts w:ascii="Times New Roman" w:hAnsi="Times New Roman"/>
           <w:sz w:val="24"/>
         </w:rPr>
-        <w:t>If I were teaching the story, I would not begin with the themes, because to announce that it is “about prejudice” is to disarm the trap the story depends on. I would ask students to read the first two pages and write down, honestly, what they think of Kelada, then have them mark which of those impressions came from Kelada’s own words and which were handed to them by the narrator. The word “Levantine” is where the discussion turns serious, because it lets a class separate disliking a person’s manners from disliking his origins, and see how easily the second hides inside the first. For learners of English the story has a further gift: its meaning turns on a reversal they can feel before they can fully name it, so the close reading of language and the moral recognition arrive together. Working through it changed how I read the narrator, and with him myself, because it showed me how much of my judgment had been handed over, ready-made, to a man who was wrong about the one thing he was surest of, and left me, like him, able only to say that I had been mistaken.</w:t>
+        <w:t>If I were teaching the story, I would not begin with the themes, because to announce that it is “about prejudice” is to disarm the trap the story depends on. I would ask students to read the first two pages and write down, honestly, what they think of Kelada, then have them mark which of those impressions came from Kelada’s own words and which were handed to them by the narrator. The word “Levantine” (Maugham, 1936) is where the discussion turns serious, because it lets a class separate disliking a person’s manners from disliking his origins, and see how easily the second hides inside the first. For learners of English the story has a further gift: its meaning turns on a reversal they can feel before they can fully name it, so the close reading of language and the moral recognition arrive together. Working through it changed how I read the narrator, and with him myself, because it showed me how much of my judgment had been handed over, ready-made, to a man who was wrong about the one thing he was surest of, and left me, like him, able only to say that I had been mistaken.</w:t>
       </w:r>
     </w:p>
     <w:p>

</xml_diff>

<commit_message>
Add clickable source links to the reference list (short version)
Append a live hyperlink to each of the 9 references (publisher page, Internet
Archive, Open Library, or PhilPapers), sourced from web search. References set
to left alignment (APA) to avoid justified gaps around URLs.

Co-Authored-By: Claude Opus 4.8 <noreply@anthropic.com>
Claude-Session: https://claude.ai/code/session_01VbbPAGC8dgxj7crtn1UqbW
</commit_message>
<xml_diff>
--- a/Mr_Know-All_Short_3Themes.docx
+++ b/Mr_Know-All_Short_3Themes.docx
@@ -414,127 +414,226 @@
       <w:pPr>
         <w:spacing w:line="360" w:lineRule="auto"/>
         <w:ind w:left="720" w:hanging="720"/>
-        <w:jc w:val="both"/>
+        <w:jc w:val="left"/>
       </w:pPr>
       <w:r>
         <w:rPr>
           <w:rFonts w:ascii="Times New Roman" w:hAnsi="Times New Roman"/>
           <w:sz w:val="24"/>
         </w:rPr>
-        <w:t>Allport, G. W. (1979). The nature of prejudice (25th anniversary ed.). Addison-Wesley. (Original work published 1954)</w:t>
+        <w:t xml:space="preserve">Allport, G. W. (1979). The nature of prejudice (25th anniversary ed.). Addison-Wesley. (Original work published 1954). </w:t>
       </w:r>
+      <w:hyperlink r:id="rId10">
+        <w:r>
+          <w:rPr>
+            <w:rFonts w:ascii="Times New Roman" w:hAnsi="Times New Roman" w:cs="Times New Roman"/>
+            <w:sz w:val="24"/>
+            <w:color w:val="0563C1"/>
+            <w:u w:val="single"/>
+          </w:rPr>
+          <w:t xml:space="preserve">https://openlibrary.org/works/OL3420407W/The_nature_of_prejudice</w:t>
+        </w:r>
+      </w:hyperlink>
     </w:p>
     <w:p>
       <w:pPr>
         <w:spacing w:line="360" w:lineRule="auto"/>
         <w:ind w:left="720" w:hanging="720"/>
-        <w:jc w:val="both"/>
+        <w:jc w:val="left"/>
       </w:pPr>
       <w:r>
         <w:rPr>
           <w:rFonts w:ascii="Times New Roman" w:hAnsi="Times New Roman"/>
           <w:sz w:val="24"/>
         </w:rPr>
-        <w:t>Aristotle. (1996). Poetics (M. Heath, Trans.). Penguin Books. (Original work published ca. 335 BCE)</w:t>
+        <w:t xml:space="preserve">Aristotle. (1996). Poetics (M. Heath, Trans.). Penguin Books. (Original work published ca. 335 BCE). </w:t>
       </w:r>
+      <w:hyperlink r:id="rId11">
+        <w:r>
+          <w:rPr>
+            <w:rFonts w:ascii="Times New Roman" w:hAnsi="Times New Roman" w:cs="Times New Roman"/>
+            <w:sz w:val="24"/>
+            <w:color w:val="0563C1"/>
+            <w:u w:val="single"/>
+          </w:rPr>
+          <w:t xml:space="preserve">https://www.penguinrandomhouse.com/books/260883/poetics-by-aristotle/</w:t>
+        </w:r>
+      </w:hyperlink>
     </w:p>
     <w:p>
       <w:pPr>
         <w:spacing w:line="360" w:lineRule="auto"/>
         <w:ind w:left="720" w:hanging="720"/>
-        <w:jc w:val="both"/>
+        <w:jc w:val="left"/>
       </w:pPr>
       <w:r>
         <w:rPr>
           <w:rFonts w:ascii="Times New Roman" w:hAnsi="Times New Roman"/>
           <w:sz w:val="24"/>
         </w:rPr>
-        <w:t>Booth, W. C. (1983). The rhetoric of fiction (2nd ed.). University of Chicago Press.</w:t>
+        <w:t xml:space="preserve">Booth, W. C. (1983). The rhetoric of fiction (2nd ed.). University of Chicago Press. </w:t>
       </w:r>
+      <w:hyperlink r:id="rId12">
+        <w:r>
+          <w:rPr>
+            <w:rFonts w:ascii="Times New Roman" w:hAnsi="Times New Roman" w:cs="Times New Roman"/>
+            <w:sz w:val="24"/>
+            <w:color w:val="0563C1"/>
+            <w:u w:val="single"/>
+          </w:rPr>
+          <w:t xml:space="preserve">https://press.uchicago.edu/ucp/books/book/chicago/R/bo5965941.html</w:t>
+        </w:r>
+      </w:hyperlink>
     </w:p>
     <w:p>
       <w:pPr>
         <w:spacing w:line="360" w:lineRule="auto"/>
         <w:ind w:left="720" w:hanging="720"/>
-        <w:jc w:val="both"/>
+        <w:jc w:val="left"/>
       </w:pPr>
       <w:r>
         <w:rPr>
           <w:rFonts w:ascii="Times New Roman" w:hAnsi="Times New Roman"/>
           <w:sz w:val="24"/>
         </w:rPr>
-        <w:t>Fanon, F. (2008). Black skin, white masks (R. Philcox, Trans.). Grove Press. (Original work published 1952)</w:t>
+        <w:t xml:space="preserve">Fanon, F. (2008). Black skin, white masks (R. Philcox, Trans.). Grove Press. (Original work published 1952). </w:t>
       </w:r>
+      <w:hyperlink r:id="rId13">
+        <w:r>
+          <w:rPr>
+            <w:rFonts w:ascii="Times New Roman" w:hAnsi="Times New Roman" w:cs="Times New Roman"/>
+            <w:sz w:val="24"/>
+            <w:color w:val="0563C1"/>
+            <w:u w:val="single"/>
+          </w:rPr>
+          <w:t xml:space="preserve">https://groveatlantic.com/book/black-skin-white-masks/</w:t>
+        </w:r>
+      </w:hyperlink>
     </w:p>
     <w:p>
       <w:pPr>
         <w:spacing w:line="360" w:lineRule="auto"/>
         <w:ind w:left="720" w:hanging="720"/>
-        <w:jc w:val="both"/>
+        <w:jc w:val="left"/>
       </w:pPr>
       <w:r>
         <w:rPr>
           <w:rFonts w:ascii="Times New Roman" w:hAnsi="Times New Roman"/>
           <w:sz w:val="24"/>
         </w:rPr>
-        <w:t>Kahneman, D. (2011). Thinking, fast and slow. Farrar, Straus and Giroux.</w:t>
+        <w:t xml:space="preserve">Kahneman, D. (2011). Thinking, fast and slow. Farrar, Straus and Giroux. </w:t>
       </w:r>
+      <w:hyperlink r:id="rId14">
+        <w:r>
+          <w:rPr>
+            <w:rFonts w:ascii="Times New Roman" w:hAnsi="Times New Roman" w:cs="Times New Roman"/>
+            <w:sz w:val="24"/>
+            <w:color w:val="0563C1"/>
+            <w:u w:val="single"/>
+          </w:rPr>
+          <w:t xml:space="preserve">https://archive.org/details/thinkingfastslow0000kahn</w:t>
+        </w:r>
+      </w:hyperlink>
     </w:p>
     <w:p>
       <w:pPr>
         <w:spacing w:line="360" w:lineRule="auto"/>
         <w:ind w:left="720" w:hanging="720"/>
-        <w:jc w:val="both"/>
+        <w:jc w:val="left"/>
       </w:pPr>
       <w:r>
         <w:rPr>
           <w:rFonts w:ascii="Times New Roman" w:hAnsi="Times New Roman"/>
           <w:sz w:val="24"/>
         </w:rPr>
-        <w:t>Kant, I. (1998). Groundwork of the metaphysics of morals (M. Gregor, Ed. &amp; Trans.). Cambridge University Press. (Original work published 1785)</w:t>
+        <w:t xml:space="preserve">Kant, I. (1998). Groundwork of the metaphysics of morals (M. Gregor, Ed. &amp; Trans.). Cambridge University Press. (Original work published 1785). </w:t>
       </w:r>
+      <w:hyperlink r:id="rId15">
+        <w:r>
+          <w:rPr>
+            <w:rFonts w:ascii="Times New Roman" w:hAnsi="Times New Roman" w:cs="Times New Roman"/>
+            <w:sz w:val="24"/>
+            <w:color w:val="0563C1"/>
+            <w:u w:val="single"/>
+          </w:rPr>
+          <w:t xml:space="preserve">https://philpapers.org/rec/KANGFT</w:t>
+        </w:r>
+      </w:hyperlink>
     </w:p>
     <w:p>
       <w:pPr>
         <w:spacing w:line="360" w:lineRule="auto"/>
         <w:ind w:left="720" w:hanging="720"/>
-        <w:jc w:val="both"/>
+        <w:jc w:val="left"/>
       </w:pPr>
       <w:r>
         <w:rPr>
           <w:rFonts w:ascii="Times New Roman" w:hAnsi="Times New Roman"/>
           <w:sz w:val="24"/>
         </w:rPr>
-        <w:t>Maugham, W. S. (1936). Mr. Know-All. In Cosmopolitans: Very short stories. William Heinemann.</w:t>
+        <w:t xml:space="preserve">Maugham, W. S. (1936). Mr. Know-All. In Cosmopolitans: Very short stories. William Heinemann. </w:t>
       </w:r>
+      <w:hyperlink r:id="rId16">
+        <w:r>
+          <w:rPr>
+            <w:rFonts w:ascii="Times New Roman" w:hAnsi="Times New Roman" w:cs="Times New Roman"/>
+            <w:sz w:val="24"/>
+            <w:color w:val="0563C1"/>
+            <w:u w:val="single"/>
+          </w:rPr>
+          <w:t xml:space="preserve">https://archive.org/details/cosmopolitans00maug</w:t>
+        </w:r>
+      </w:hyperlink>
     </w:p>
     <w:p>
       <w:pPr>
         <w:spacing w:line="360" w:lineRule="auto"/>
         <w:ind w:left="720" w:hanging="720"/>
-        <w:jc w:val="both"/>
+        <w:jc w:val="left"/>
       </w:pPr>
       <w:r>
         <w:rPr>
           <w:rFonts w:ascii="Times New Roman" w:hAnsi="Times New Roman"/>
           <w:sz w:val="24"/>
         </w:rPr>
-        <w:t>Nussbaum, M. C. (1995). Poetic justice: The literary imagination and public life. Beacon Press.</w:t>
+        <w:t xml:space="preserve">Nussbaum, M. C. (1995). Poetic justice: The literary imagination and public life. Beacon Press. </w:t>
       </w:r>
+      <w:hyperlink r:id="rId17">
+        <w:r>
+          <w:rPr>
+            <w:rFonts w:ascii="Times New Roman" w:hAnsi="Times New Roman" w:cs="Times New Roman"/>
+            <w:sz w:val="24"/>
+            <w:color w:val="0563C1"/>
+            <w:u w:val="single"/>
+          </w:rPr>
+          <w:t xml:space="preserve">https://www.beacon.org/Poetic-Justice-P313.aspx</w:t>
+        </w:r>
+      </w:hyperlink>
     </w:p>
     <w:p>
       <w:pPr>
         <w:spacing w:line="360" w:lineRule="auto"/>
         <w:ind w:left="720" w:hanging="720"/>
-        <w:jc w:val="both"/>
+        <w:jc w:val="left"/>
       </w:pPr>
       <w:r>
         <w:rPr>
           <w:rFonts w:ascii="Times New Roman" w:hAnsi="Times New Roman"/>
           <w:sz w:val="24"/>
         </w:rPr>
-        <w:t>Said, E. W. (1978). Orientalism. Pantheon Books.</w:t>
+        <w:t xml:space="preserve">Said, E. W. (1978). Orientalism. Pantheon Books. </w:t>
       </w:r>
+      <w:hyperlink r:id="rId18">
+        <w:r>
+          <w:rPr>
+            <w:rFonts w:ascii="Times New Roman" w:hAnsi="Times New Roman" w:cs="Times New Roman"/>
+            <w:sz w:val="24"/>
+            <w:color w:val="0563C1"/>
+            <w:u w:val="single"/>
+          </w:rPr>
+          <w:t xml:space="preserve">https://archive.org/details/orientalism0000said_r4m0</w:t>
+        </w:r>
+      </w:hyperlink>
     </w:p>
     <w:sectPr>
       <w:headerReference w:type="default" r:id="rId9"/>

</xml_diff>